<commit_message>
README: hướng dẫn cài đặt dùng chung (venv/conda, pip install -e), bỏ tên env cục bộ
</commit_message>
<xml_diff>
--- a/docs/final/Group44_SE373.R11_BTVN7_ChallengeB.docx
+++ b/docs/final/Group44_SE373.R11_BTVN7_ChallengeB.docx
@@ -68,10 +68,10 @@
           <w:noProof/>
         </w:rPr>
         <w:drawing>
-          <wp:inline distT="0" distB="0" distL="0" distR="0" wp14:anchorId="26CDB2E2" wp14:editId="251D8B33">
+          <wp:inline distT="0" distB="0" distL="0" distR="0" wp14:anchorId="29BB2E31" wp14:editId="00B84FDA">
             <wp:extent cx="1800000" cy="1484462"/>
             <wp:effectExtent l="0" t="0" r="0" b="0"/>
-            <wp:docPr id="1375421085" name="Picture 1"/>
+            <wp:docPr id="776850543" name="Picture 1"/>
             <wp:cNvGraphicFramePr>
               <a:graphicFrameLocks xmlns:a="http://schemas.openxmlformats.org/drawingml/2006/main" noChangeAspect="1"/>
             </wp:cNvGraphicFramePr>
@@ -79,7 +79,7 @@
               <a:graphicData uri="http://schemas.openxmlformats.org/drawingml/2006/picture">
                 <pic:pic xmlns:pic="http://schemas.openxmlformats.org/drawingml/2006/picture">
                   <pic:nvPicPr>
-                    <pic:cNvPr id="1375421085" name=""/>
+                    <pic:cNvPr id="776850543" name=""/>
                     <pic:cNvPicPr/>
                   </pic:nvPicPr>
                   <pic:blipFill>
@@ -296,7 +296,7 @@
         <w:rPr>
           <w:noProof/>
         </w:rPr>
-        <w:instrText xml:space="preserve"> PAGEREF _Toc243996979 \h </w:instrText>
+        <w:instrText xml:space="preserve"> PAGEREF _Toc243998221 \h </w:instrText>
       </w:r>
       <w:r>
         <w:rPr>
@@ -358,7 +358,7 @@
         <w:rPr>
           <w:noProof/>
         </w:rPr>
-        <w:instrText xml:space="preserve"> PAGEREF _Toc243996980 \h </w:instrText>
+        <w:instrText xml:space="preserve"> PAGEREF _Toc243998222 \h </w:instrText>
       </w:r>
       <w:r>
         <w:rPr>
@@ -420,7 +420,7 @@
         <w:rPr>
           <w:noProof/>
         </w:rPr>
-        <w:instrText xml:space="preserve"> PAGEREF _Toc243996981 \h </w:instrText>
+        <w:instrText xml:space="preserve"> PAGEREF _Toc243998223 \h </w:instrText>
       </w:r>
       <w:r>
         <w:rPr>
@@ -482,7 +482,7 @@
         <w:rPr>
           <w:noProof/>
         </w:rPr>
-        <w:instrText xml:space="preserve"> PAGEREF _Toc243996982 \h </w:instrText>
+        <w:instrText xml:space="preserve"> PAGEREF _Toc243998224 \h </w:instrText>
       </w:r>
       <w:r>
         <w:rPr>
@@ -544,7 +544,7 @@
         <w:rPr>
           <w:noProof/>
         </w:rPr>
-        <w:instrText xml:space="preserve"> PAGEREF _Toc243996983 \h </w:instrText>
+        <w:instrText xml:space="preserve"> PAGEREF _Toc243998225 \h </w:instrText>
       </w:r>
       <w:r>
         <w:rPr>
@@ -606,7 +606,7 @@
         <w:rPr>
           <w:noProof/>
         </w:rPr>
-        <w:instrText xml:space="preserve"> PAGEREF _Toc243996984 \h </w:instrText>
+        <w:instrText xml:space="preserve"> PAGEREF _Toc243998226 \h </w:instrText>
       </w:r>
       <w:r>
         <w:rPr>
@@ -668,7 +668,7 @@
         <w:rPr>
           <w:noProof/>
         </w:rPr>
-        <w:instrText xml:space="preserve"> PAGEREF _Toc243996985 \h </w:instrText>
+        <w:instrText xml:space="preserve"> PAGEREF _Toc243998227 \h </w:instrText>
       </w:r>
       <w:r>
         <w:rPr>
@@ -730,7 +730,7 @@
         <w:rPr>
           <w:noProof/>
         </w:rPr>
-        <w:instrText xml:space="preserve"> PAGEREF _Toc243996986 \h </w:instrText>
+        <w:instrText xml:space="preserve"> PAGEREF _Toc243998228 \h </w:instrText>
       </w:r>
       <w:r>
         <w:rPr>
@@ -792,7 +792,7 @@
         <w:rPr>
           <w:noProof/>
         </w:rPr>
-        <w:instrText xml:space="preserve"> PAGEREF _Toc243996987 \h </w:instrText>
+        <w:instrText xml:space="preserve"> PAGEREF _Toc243998229 \h </w:instrText>
       </w:r>
       <w:r>
         <w:rPr>
@@ -854,7 +854,7 @@
         <w:rPr>
           <w:noProof/>
         </w:rPr>
-        <w:instrText xml:space="preserve"> PAGEREF _Toc243996988 \h </w:instrText>
+        <w:instrText xml:space="preserve"> PAGEREF _Toc243998230 \h </w:instrText>
       </w:r>
       <w:r>
         <w:rPr>
@@ -916,7 +916,7 @@
         <w:rPr>
           <w:noProof/>
         </w:rPr>
-        <w:instrText xml:space="preserve"> PAGEREF _Toc243996989 \h </w:instrText>
+        <w:instrText xml:space="preserve"> PAGEREF _Toc243998231 \h </w:instrText>
       </w:r>
       <w:r>
         <w:rPr>
@@ -978,7 +978,7 @@
         <w:rPr>
           <w:noProof/>
         </w:rPr>
-        <w:instrText xml:space="preserve"> PAGEREF _Toc243996990 \h </w:instrText>
+        <w:instrText xml:space="preserve"> PAGEREF _Toc243998232 \h </w:instrText>
       </w:r>
       <w:r>
         <w:rPr>
@@ -1040,7 +1040,7 @@
         <w:rPr>
           <w:noProof/>
         </w:rPr>
-        <w:instrText xml:space="preserve"> PAGEREF _Toc243996991 \h </w:instrText>
+        <w:instrText xml:space="preserve"> PAGEREF _Toc243998233 \h </w:instrText>
       </w:r>
       <w:r>
         <w:rPr>
@@ -1102,7 +1102,7 @@
         <w:rPr>
           <w:noProof/>
         </w:rPr>
-        <w:instrText xml:space="preserve"> PAGEREF _Toc243996992 \h </w:instrText>
+        <w:instrText xml:space="preserve"> PAGEREF _Toc243998234 \h </w:instrText>
       </w:r>
       <w:r>
         <w:rPr>
@@ -1164,7 +1164,7 @@
         <w:rPr>
           <w:noProof/>
         </w:rPr>
-        <w:instrText xml:space="preserve"> PAGEREF _Toc243996993 \h </w:instrText>
+        <w:instrText xml:space="preserve"> PAGEREF _Toc243998235 \h </w:instrText>
       </w:r>
       <w:r>
         <w:rPr>
@@ -1226,7 +1226,7 @@
         <w:rPr>
           <w:noProof/>
         </w:rPr>
-        <w:instrText xml:space="preserve"> PAGEREF _Toc243996994 \h </w:instrText>
+        <w:instrText xml:space="preserve"> PAGEREF _Toc243998236 \h </w:instrText>
       </w:r>
       <w:r>
         <w:rPr>
@@ -1288,7 +1288,7 @@
         <w:rPr>
           <w:noProof/>
         </w:rPr>
-        <w:instrText xml:space="preserve"> PAGEREF _Toc243996995 \h </w:instrText>
+        <w:instrText xml:space="preserve"> PAGEREF _Toc243998237 \h </w:instrText>
       </w:r>
       <w:r>
         <w:rPr>
@@ -1350,7 +1350,7 @@
         <w:rPr>
           <w:noProof/>
         </w:rPr>
-        <w:instrText xml:space="preserve"> PAGEREF _Toc243996996 \h </w:instrText>
+        <w:instrText xml:space="preserve"> PAGEREF _Toc243998238 \h </w:instrText>
       </w:r>
       <w:r>
         <w:rPr>
@@ -1412,7 +1412,7 @@
         <w:rPr>
           <w:noProof/>
         </w:rPr>
-        <w:instrText xml:space="preserve"> PAGEREF _Toc243996997 \h </w:instrText>
+        <w:instrText xml:space="preserve"> PAGEREF _Toc243998239 \h </w:instrText>
       </w:r>
       <w:r>
         <w:rPr>
@@ -1474,7 +1474,7 @@
         <w:rPr>
           <w:noProof/>
         </w:rPr>
-        <w:instrText xml:space="preserve"> PAGEREF _Toc243996998 \h </w:instrText>
+        <w:instrText xml:space="preserve"> PAGEREF _Toc243998240 \h </w:instrText>
       </w:r>
       <w:r>
         <w:rPr>
@@ -1536,7 +1536,7 @@
         <w:rPr>
           <w:noProof/>
         </w:rPr>
-        <w:instrText xml:space="preserve"> PAGEREF _Toc243996999 \h </w:instrText>
+        <w:instrText xml:space="preserve"> PAGEREF _Toc243998241 \h </w:instrText>
       </w:r>
       <w:r>
         <w:rPr>
@@ -1598,7 +1598,7 @@
         <w:rPr>
           <w:noProof/>
         </w:rPr>
-        <w:instrText xml:space="preserve"> PAGEREF _Toc243997000 \h </w:instrText>
+        <w:instrText xml:space="preserve"> PAGEREF _Toc243998242 \h </w:instrText>
       </w:r>
       <w:r>
         <w:rPr>
@@ -1660,7 +1660,7 @@
         <w:rPr>
           <w:noProof/>
         </w:rPr>
-        <w:instrText xml:space="preserve"> PAGEREF _Toc243997001 \h </w:instrText>
+        <w:instrText xml:space="preserve"> PAGEREF _Toc243998243 \h </w:instrText>
       </w:r>
       <w:r>
         <w:rPr>
@@ -1722,7 +1722,7 @@
         <w:rPr>
           <w:noProof/>
         </w:rPr>
-        <w:instrText xml:space="preserve"> PAGEREF _Toc243997002 \h </w:instrText>
+        <w:instrText xml:space="preserve"> PAGEREF _Toc243998244 \h </w:instrText>
       </w:r>
       <w:r>
         <w:rPr>
@@ -1784,7 +1784,7 @@
         <w:rPr>
           <w:noProof/>
         </w:rPr>
-        <w:instrText xml:space="preserve"> PAGEREF _Toc243997003 \h </w:instrText>
+        <w:instrText xml:space="preserve"> PAGEREF _Toc243998245 \h </w:instrText>
       </w:r>
       <w:r>
         <w:rPr>
@@ -1846,7 +1846,7 @@
         <w:rPr>
           <w:noProof/>
         </w:rPr>
-        <w:instrText xml:space="preserve"> PAGEREF _Toc243997004 \h </w:instrText>
+        <w:instrText xml:space="preserve"> PAGEREF _Toc243998246 \h </w:instrText>
       </w:r>
       <w:r>
         <w:rPr>
@@ -1908,7 +1908,7 @@
         <w:rPr>
           <w:noProof/>
         </w:rPr>
-        <w:instrText xml:space="preserve"> PAGEREF _Toc243997005 \h </w:instrText>
+        <w:instrText xml:space="preserve"> PAGEREF _Toc243998247 \h </w:instrText>
       </w:r>
       <w:r>
         <w:rPr>
@@ -1970,7 +1970,7 @@
         <w:rPr>
           <w:noProof/>
         </w:rPr>
-        <w:instrText xml:space="preserve"> PAGEREF _Toc243997006 \h </w:instrText>
+        <w:instrText xml:space="preserve"> PAGEREF _Toc243998248 \h </w:instrText>
       </w:r>
       <w:r>
         <w:rPr>
@@ -2032,7 +2032,7 @@
         <w:rPr>
           <w:noProof/>
         </w:rPr>
-        <w:instrText xml:space="preserve"> PAGEREF _Toc243997007 \h </w:instrText>
+        <w:instrText xml:space="preserve"> PAGEREF _Toc243998249 \h </w:instrText>
       </w:r>
       <w:r>
         <w:rPr>
@@ -2094,7 +2094,7 @@
         <w:rPr>
           <w:noProof/>
         </w:rPr>
-        <w:instrText xml:space="preserve"> PAGEREF _Toc243997008 \h </w:instrText>
+        <w:instrText xml:space="preserve"> PAGEREF _Toc243998250 \h </w:instrText>
       </w:r>
       <w:r>
         <w:rPr>
@@ -2156,7 +2156,7 @@
         <w:rPr>
           <w:noProof/>
         </w:rPr>
-        <w:instrText xml:space="preserve"> PAGEREF _Toc243997009 \h </w:instrText>
+        <w:instrText xml:space="preserve"> PAGEREF _Toc243998251 \h </w:instrText>
       </w:r>
       <w:r>
         <w:rPr>
@@ -2218,7 +2218,7 @@
         <w:rPr>
           <w:noProof/>
         </w:rPr>
-        <w:instrText xml:space="preserve"> PAGEREF _Toc243997010 \h </w:instrText>
+        <w:instrText xml:space="preserve"> PAGEREF _Toc243998252 \h </w:instrText>
       </w:r>
       <w:r>
         <w:rPr>
@@ -2280,7 +2280,7 @@
         <w:rPr>
           <w:noProof/>
         </w:rPr>
-        <w:instrText xml:space="preserve"> PAGEREF _Toc243997011 \h </w:instrText>
+        <w:instrText xml:space="preserve"> PAGEREF _Toc243998253 \h </w:instrText>
       </w:r>
       <w:r>
         <w:rPr>
@@ -2342,7 +2342,7 @@
         <w:rPr>
           <w:noProof/>
         </w:rPr>
-        <w:instrText xml:space="preserve"> PAGEREF _Toc243997012 \h </w:instrText>
+        <w:instrText xml:space="preserve"> PAGEREF _Toc243998254 \h </w:instrText>
       </w:r>
       <w:r>
         <w:rPr>
@@ -2404,7 +2404,7 @@
         <w:rPr>
           <w:noProof/>
         </w:rPr>
-        <w:instrText xml:space="preserve"> PAGEREF _Toc243997013 \h </w:instrText>
+        <w:instrText xml:space="preserve"> PAGEREF _Toc243998255 \h </w:instrText>
       </w:r>
       <w:r>
         <w:rPr>
@@ -2466,7 +2466,7 @@
         <w:rPr>
           <w:noProof/>
         </w:rPr>
-        <w:instrText xml:space="preserve"> PAGEREF _Toc243997014 \h </w:instrText>
+        <w:instrText xml:space="preserve"> PAGEREF _Toc243998256 \h </w:instrText>
       </w:r>
       <w:r>
         <w:rPr>
@@ -2520,7 +2520,7 @@
       <w:pPr>
         <w:pStyle w:val="Heading1"/>
       </w:pPr>
-      <w:bookmarkStart w:id="1" w:name="_Toc243996979"/>
+      <w:bookmarkStart w:id="1" w:name="_Toc243998221"/>
       <w:r>
         <w:lastRenderedPageBreak/>
         <w:t>1</w:t>
@@ -2541,7 +2541,7 @@
         <w:pStyle w:val="Heading2"/>
       </w:pPr>
       <w:bookmarkStart w:id="2" w:name="đề-bài"/>
-      <w:bookmarkStart w:id="3" w:name="_Toc243996980"/>
+      <w:bookmarkStart w:id="3" w:name="_Toc243998222"/>
       <w:r>
         <w:t>1.1 Đ</w:t>
       </w:r>
@@ -3533,7 +3533,7 @@
         <w:pStyle w:val="Heading2"/>
       </w:pPr>
       <w:bookmarkStart w:id="4" w:name="tóm-tắt-kết-quả"/>
-      <w:bookmarkStart w:id="5" w:name="_Toc243996981"/>
+      <w:bookmarkStart w:id="5" w:name="_Toc243998223"/>
       <w:bookmarkEnd w:id="2"/>
       <w:r>
         <w:t>1.2 Tóm t</w:t>
@@ -4472,7 +4472,7 @@
         <w:pStyle w:val="Heading1"/>
       </w:pPr>
       <w:bookmarkStart w:id="6" w:name="cấu-hình-môi-trường"/>
-      <w:bookmarkStart w:id="7" w:name="_Toc243996982"/>
+      <w:bookmarkStart w:id="7" w:name="_Toc243998224"/>
       <w:bookmarkEnd w:id="0"/>
       <w:bookmarkEnd w:id="4"/>
       <w:r>
@@ -4636,26 +4636,43 @@
               <w:rPr>
                 <w:sz w:val="21"/>
               </w:rPr>
-              <w:t>Python 3.11, môi trư</w:t>
-            </w:r>
-            <w:r>
-              <w:rPr>
-                <w:sz w:val="21"/>
-              </w:rPr>
-              <w:t>ờ</w:t>
-            </w:r>
-            <w:r>
-              <w:rPr>
-                <w:sz w:val="21"/>
-              </w:rPr>
-              <w:t xml:space="preserve">ng conda </w:t>
-            </w:r>
-            <w:r>
-              <w:rPr>
-                <w:rStyle w:val="VerbatimChar"/>
-                <w:sz w:val="21"/>
-              </w:rPr>
-              <w:t>se373</w:t>
+              <w:t>Python 3.11 tr</w:t>
+            </w:r>
+            <w:r>
+              <w:rPr>
+                <w:sz w:val="21"/>
+              </w:rPr>
+              <w:t>ở</w:t>
+            </w:r>
+            <w:r>
+              <w:rPr>
+                <w:sz w:val="21"/>
+              </w:rPr>
+              <w:t xml:space="preserve"> lên (nhóm th</w:t>
+            </w:r>
+            <w:r>
+              <w:rPr>
+                <w:sz w:val="21"/>
+              </w:rPr>
+              <w:t>ử</w:t>
+            </w:r>
+            <w:r>
+              <w:rPr>
+                <w:sz w:val="21"/>
+              </w:rPr>
+              <w:t xml:space="preserve"> nghi</w:t>
+            </w:r>
+            <w:r>
+              <w:rPr>
+                <w:sz w:val="21"/>
+              </w:rPr>
+              <w:t>ệ</w:t>
+            </w:r>
+            <w:r>
+              <w:rPr>
+                <w:sz w:val="21"/>
+              </w:rPr>
+              <w:t>m trên Python 3.11.16, Windows 11)</w:t>
             </w:r>
           </w:p>
         </w:tc>
@@ -5095,7 +5112,13 @@
                 <w:rStyle w:val="VerbatimChar"/>
                 <w:sz w:val="21"/>
               </w:rPr>
-              <w:t>Chanllenge_B/src/</w:t>
+              <w:t>src/</w:t>
+            </w:r>
+            <w:r>
+              <w:rPr>
+                <w:sz w:val="21"/>
+              </w:rPr>
+              <w:t>, repo https://github.com/dthanhman/Compact-Challenge-B</w:t>
             </w:r>
           </w:p>
         </w:tc>
@@ -5118,7 +5141,25 @@
         <w:t>ạ</w:t>
       </w:r>
       <w:r>
-        <w:t>y (Windows):</w:t>
+        <w:t xml:space="preserve">y (Windows; macOS/Linux dùng </w:t>
+      </w:r>
+      <w:r>
+        <w:rPr>
+          <w:rStyle w:val="VerbatimChar"/>
+        </w:rPr>
+        <w:t>source .venv/bin/activate</w:t>
+      </w:r>
+      <w:r>
+        <w:t xml:space="preserve"> và </w:t>
+      </w:r>
+      <w:r>
+        <w:rPr>
+          <w:rStyle w:val="VerbatimChar"/>
+        </w:rPr>
+        <w:t>cp</w:t>
+      </w:r>
+      <w:r>
+        <w:t>):</w:t>
       </w:r>
     </w:p>
     <w:p>
@@ -5129,7 +5170,8 @@
         <w:rPr>
           <w:rStyle w:val="VerbatimChar"/>
         </w:rPr>
-        <w:t>conda activate se373</w:t>
+        <w:lastRenderedPageBreak/>
+        <w:t>git clone https://github.com/dthanhman/Compact-Challenge-B.git</w:t>
       </w:r>
       <w:r>
         <w:br/>
@@ -5138,7 +5180,7 @@
         <w:rPr>
           <w:rStyle w:val="VerbatimChar"/>
         </w:rPr>
-        <w:t>cd Chanllenge_B</w:t>
+        <w:t>cd Compact-Challenge-B</w:t>
       </w:r>
       <w:r>
         <w:br/>
@@ -5147,7 +5189,81 @@
         <w:rPr>
           <w:rStyle w:val="VerbatimChar"/>
         </w:rPr>
-        <w:lastRenderedPageBreak/>
+        <w:t>python -m venv .venv</w:t>
+      </w:r>
+      <w:r>
+        <w:br/>
+      </w:r>
+      <w:r>
+        <w:rPr>
+          <w:rStyle w:val="VerbatimChar"/>
+        </w:rPr>
+        <w:t>.venv\Scripts\activate          :: ho</w:t>
+      </w:r>
+      <w:r>
+        <w:rPr>
+          <w:rStyle w:val="VerbatimChar"/>
+        </w:rPr>
+        <w:t>ặ</w:t>
+      </w:r>
+      <w:r>
+        <w:rPr>
+          <w:rStyle w:val="VerbatimChar"/>
+        </w:rPr>
+        <w:t>c m</w:t>
+      </w:r>
+      <w:r>
+        <w:rPr>
+          <w:rStyle w:val="VerbatimChar"/>
+        </w:rPr>
+        <w:t>ộ</w:t>
+      </w:r>
+      <w:r>
+        <w:rPr>
+          <w:rStyle w:val="VerbatimChar"/>
+        </w:rPr>
+        <w:t>t env conda b</w:t>
+      </w:r>
+      <w:r>
+        <w:rPr>
+          <w:rStyle w:val="VerbatimChar"/>
+        </w:rPr>
+        <w:t>ấ</w:t>
+      </w:r>
+      <w:r>
+        <w:rPr>
+          <w:rStyle w:val="VerbatimChar"/>
+        </w:rPr>
+        <w:t>t k</w:t>
+      </w:r>
+      <w:r>
+        <w:rPr>
+          <w:rStyle w:val="VerbatimChar"/>
+        </w:rPr>
+        <w:t>ỳ</w:t>
+      </w:r>
+      <w:r>
+        <w:rPr>
+          <w:rStyle w:val="VerbatimChar"/>
+        </w:rPr>
+        <w:t xml:space="preserve"> có Python 3.11+</w:t>
+      </w:r>
+      <w:r>
+        <w:br/>
+      </w:r>
+      <w:r>
+        <w:rPr>
+          <w:rStyle w:val="VerbatimChar"/>
+        </w:rPr>
+        <w:t>pip install -e ".[ui,dev]"</w:t>
+      </w:r>
+      <w:r>
+        <w:br/>
+      </w:r>
+      <w:r>
+        <w:rPr>
+          <w:rStyle w:val="VerbatimChar"/>
+        </w:rPr>
         <w:t>copy .env.example .env          :: đi</w:t>
       </w:r>
       <w:r>
@@ -5161,15 +5277,6 @@
           <w:rStyle w:val="VerbatimChar"/>
         </w:rPr>
         <w:t>n GEMINI_API_KEY</w:t>
-      </w:r>
-      <w:r>
-        <w:br/>
-      </w:r>
-      <w:r>
-        <w:rPr>
-          <w:rStyle w:val="VerbatimChar"/>
-        </w:rPr>
-        <w:t>set PYTHONPATH=src              :: PowerShell: $env:PYTHONPATH="src"</w:t>
       </w:r>
       <w:r>
         <w:br/>
@@ -5385,7 +5492,7 @@
         <w:pStyle w:val="Heading1"/>
       </w:pPr>
       <w:bookmarkStart w:id="8" w:name="thiết-kế"/>
-      <w:bookmarkStart w:id="9" w:name="_Toc243996983"/>
+      <w:bookmarkStart w:id="9" w:name="_Toc243998225"/>
       <w:bookmarkEnd w:id="6"/>
       <w:r>
         <w:t>3. Thi</w:t>
@@ -5406,7 +5513,7 @@
         <w:pStyle w:val="Heading2"/>
       </w:pPr>
       <w:bookmarkStart w:id="10" w:name="kiến-trúc-tổng-quan"/>
-      <w:bookmarkStart w:id="11" w:name="_Toc243996984"/>
+      <w:bookmarkStart w:id="11" w:name="_Toc243998226"/>
       <w:r>
         <w:t>3.1 Ki</w:t>
       </w:r>
@@ -5429,7 +5536,7 @@
         <w:pStyle w:val="Heading3"/>
       </w:pPr>
       <w:bookmarkStart w:id="12" w:name="lựa-chọn-chính"/>
-      <w:bookmarkStart w:id="13" w:name="_Toc243996985"/>
+      <w:bookmarkStart w:id="13" w:name="_Toc243998227"/>
       <w:r>
         <w:t>3.1.1 L</w:t>
       </w:r>
@@ -6065,7 +6172,13 @@
               <w:rPr>
                 <w:sz w:val="21"/>
               </w:rPr>
-              <w:t xml:space="preserve"> sinh deterministic, có ground truth</w:t>
+              <w:t xml:space="preserve"> </w:t>
+            </w:r>
+            <w:r>
+              <w:rPr>
+                <w:sz w:val="21"/>
+              </w:rPr>
+              <w:t>sinh deterministic, có ground truth</w:t>
             </w:r>
           </w:p>
         </w:tc>
@@ -6282,7 +6395,7 @@
         <w:pStyle w:val="Heading3"/>
       </w:pPr>
       <w:bookmarkStart w:id="14" w:name="luồng-xử-lý"/>
-      <w:bookmarkStart w:id="15" w:name="_Toc243996986"/>
+      <w:bookmarkStart w:id="15" w:name="_Toc243998228"/>
       <w:bookmarkEnd w:id="12"/>
       <w:r>
         <w:t>3.1.2 Lu</w:t>
@@ -6568,7 +6681,7 @@
         </w:rPr>
         <w:lastRenderedPageBreak/>
         <w:drawing>
-          <wp:inline distT="0" distB="0" distL="0" distR="0" wp14:anchorId="53144F88" wp14:editId="4D3C053F">
+          <wp:inline distT="0" distB="0" distL="0" distR="0" wp14:anchorId="1A27FD42" wp14:editId="0B2B9942">
             <wp:extent cx="5334000" cy="2909454"/>
             <wp:effectExtent l="0" t="0" r="0" b="0"/>
             <wp:docPr id="15" name="Picture" descr="Hình 1. Các module của package ctxb và luồng gọi giữa chúng."/>
@@ -6656,7 +6769,7 @@
         <w:pStyle w:val="Heading3"/>
       </w:pPr>
       <w:bookmarkStart w:id="16" w:name="so-sánh-với-langchain"/>
-      <w:bookmarkStart w:id="17" w:name="_Toc243996987"/>
+      <w:bookmarkStart w:id="17" w:name="_Toc243998229"/>
       <w:bookmarkEnd w:id="14"/>
       <w:r>
         <w:t>3.1.3 So sánh v</w:t>
@@ -7143,7 +7256,7 @@
         <w:pStyle w:val="Heading2"/>
       </w:pPr>
       <w:bookmarkStart w:id="18" w:name="b1-compaction"/>
-      <w:bookmarkStart w:id="19" w:name="_Toc243996988"/>
+      <w:bookmarkStart w:id="19" w:name="_Toc243998230"/>
       <w:bookmarkEnd w:id="10"/>
       <w:bookmarkEnd w:id="16"/>
       <w:r>
@@ -7156,7 +7269,7 @@
         <w:pStyle w:val="Heading3"/>
       </w:pPr>
       <w:bookmarkStart w:id="20" w:name="đo-context"/>
-      <w:bookmarkStart w:id="21" w:name="_Toc243996989"/>
+      <w:bookmarkStart w:id="21" w:name="_Toc243998231"/>
       <w:r>
         <w:t>3.2.1 Đo context</w:t>
       </w:r>
@@ -7392,7 +7505,7 @@
         <w:pStyle w:val="Heading3"/>
       </w:pPr>
       <w:bookmarkStart w:id="22" w:name="thời-điểm-compact"/>
-      <w:bookmarkStart w:id="23" w:name="_Toc243996990"/>
+      <w:bookmarkStart w:id="23" w:name="_Toc243998232"/>
       <w:bookmarkEnd w:id="20"/>
       <w:r>
         <w:t>3.2.2 Th</w:t>
@@ -8038,7 +8151,7 @@
         <w:pStyle w:val="Heading3"/>
       </w:pPr>
       <w:bookmarkStart w:id="24" w:name="giữ-gì-bỏ-gì"/>
-      <w:bookmarkStart w:id="25" w:name="_Toc243996991"/>
+      <w:bookmarkStart w:id="25" w:name="_Toc243998233"/>
       <w:bookmarkEnd w:id="22"/>
       <w:r>
         <w:lastRenderedPageBreak/>
@@ -8750,7 +8863,7 @@
         <w:pStyle w:val="Heading3"/>
       </w:pPr>
       <w:bookmarkStart w:id="26" w:name="structured-checkpoint"/>
-      <w:bookmarkStart w:id="27" w:name="_Toc243996992"/>
+      <w:bookmarkStart w:id="27" w:name="_Toc243998234"/>
       <w:bookmarkEnd w:id="24"/>
       <w:r>
         <w:t>3.2.4 Structured checkpoint</w:t>
@@ -8904,10 +9017,7 @@
         <w:t>constraints</w:t>
       </w:r>
       <w:r>
-        <w:t xml:space="preserve"> </w:t>
-      </w:r>
-      <w:r>
-        <w:t>ch</w:t>
+        <w:t xml:space="preserve"> ch</w:t>
       </w:r>
       <w:r>
         <w:t>ỉ</w:t>
@@ -10392,7 +10502,7 @@
         <w:pStyle w:val="Heading3"/>
       </w:pPr>
       <w:bookmarkStart w:id="28" w:name="pipeline"/>
-      <w:bookmarkStart w:id="29" w:name="_Toc243996993"/>
+      <w:bookmarkStart w:id="29" w:name="_Toc243998235"/>
       <w:bookmarkEnd w:id="26"/>
       <w:r>
         <w:t>3.2.5 Pipeline</w:t>
@@ -10418,7 +10528,7 @@
         <w:pStyle w:val="Heading2"/>
       </w:pPr>
       <w:bookmarkStart w:id="30" w:name="b2-code-mode"/>
-      <w:bookmarkStart w:id="31" w:name="_Toc243996994"/>
+      <w:bookmarkStart w:id="31" w:name="_Toc243998236"/>
       <w:bookmarkEnd w:id="18"/>
       <w:bookmarkEnd w:id="28"/>
       <w:r>
@@ -10431,7 +10541,7 @@
         <w:pStyle w:val="Heading3"/>
       </w:pPr>
       <w:bookmarkStart w:id="32" w:name="runtime"/>
-      <w:bookmarkStart w:id="33" w:name="_Toc243996995"/>
+      <w:bookmarkStart w:id="33" w:name="_Toc243998237"/>
       <w:r>
         <w:t>3.3.1 Runtime</w:t>
       </w:r>
@@ -10509,10 +10619,7 @@
         <w:t>n sao</w:t>
       </w:r>
       <w:r>
-        <w:t xml:space="preserve"> </w:t>
-      </w:r>
-      <w:r>
-        <w:t xml:space="preserve">workspace không có file </w:t>
+        <w:t xml:space="preserve"> workspace không có file </w:t>
       </w:r>
       <w:r>
         <w:t>ẩ</w:t>
@@ -10797,7 +10904,7 @@
         <w:pStyle w:val="Heading3"/>
       </w:pPr>
       <w:bookmarkStart w:id="34" w:name="X9534a69134892ecda3e81046a6e0634cf968481"/>
-      <w:bookmarkStart w:id="35" w:name="_Toc243996996"/>
+      <w:bookmarkStart w:id="35" w:name="_Toc243998238"/>
       <w:bookmarkEnd w:id="32"/>
       <w:r>
         <w:t>3.3.2 B</w:t>
@@ -11280,7 +11387,13 @@
               <w:rPr>
                 <w:sz w:val="21"/>
               </w:rPr>
-              <w:t xml:space="preserve"> sau 3 giây, process b</w:t>
+              <w:t xml:space="preserve"> </w:t>
+            </w:r>
+            <w:r>
+              <w:rPr>
+                <w:sz w:val="21"/>
+              </w:rPr>
+              <w:t>sau 3 giây, process b</w:t>
             </w:r>
             <w:r>
               <w:rPr>
@@ -11919,7 +12032,7 @@
         <w:pStyle w:val="Heading2"/>
       </w:pPr>
       <w:bookmarkStart w:id="36" w:name="kiểm-thử-tự-động"/>
-      <w:bookmarkStart w:id="37" w:name="_Toc243996997"/>
+      <w:bookmarkStart w:id="37" w:name="_Toc243998239"/>
       <w:bookmarkEnd w:id="30"/>
       <w:bookmarkEnd w:id="34"/>
       <w:r>
@@ -12128,7 +12241,7 @@
         <w:pStyle w:val="Heading1"/>
       </w:pPr>
       <w:bookmarkStart w:id="38" w:name="evaluation"/>
-      <w:bookmarkStart w:id="39" w:name="_Toc243996998"/>
+      <w:bookmarkStart w:id="39" w:name="_Toc243998240"/>
       <w:bookmarkEnd w:id="8"/>
       <w:bookmarkEnd w:id="36"/>
       <w:r>
@@ -12141,7 +12254,7 @@
         <w:pStyle w:val="Heading2"/>
       </w:pPr>
       <w:bookmarkStart w:id="40" w:name="kịch-bản-đánh-giá"/>
-      <w:bookmarkStart w:id="41" w:name="_Toc243996999"/>
+      <w:bookmarkStart w:id="41" w:name="_Toc243998241"/>
       <w:r>
         <w:t>4.1 K</w:t>
       </w:r>
@@ -12164,7 +12277,7 @@
         <w:pStyle w:val="Heading3"/>
       </w:pPr>
       <w:bookmarkStart w:id="42" w:name="kịch-bản-b1"/>
-      <w:bookmarkStart w:id="43" w:name="_Toc243997000"/>
+      <w:bookmarkStart w:id="43" w:name="_Toc243998242"/>
       <w:r>
         <w:t>4.1.1 K</w:t>
       </w:r>
@@ -14259,7 +14372,7 @@
         <w:pStyle w:val="Heading3"/>
       </w:pPr>
       <w:bookmarkStart w:id="44" w:name="tiêu-chí-chấm-tự-động-deterministic"/>
-      <w:bookmarkStart w:id="45" w:name="_Toc243997001"/>
+      <w:bookmarkStart w:id="45" w:name="_Toc243998243"/>
       <w:bookmarkEnd w:id="42"/>
       <w:r>
         <w:t>4.1.2 Tiêu chí ch</w:t>
@@ -15439,7 +15552,7 @@
         <w:pStyle w:val="Heading3"/>
       </w:pPr>
       <w:bookmarkStart w:id="46" w:name="câu-hỏi-b2"/>
-      <w:bookmarkStart w:id="47" w:name="_Toc243997002"/>
+      <w:bookmarkStart w:id="47" w:name="_Toc243998244"/>
       <w:bookmarkEnd w:id="44"/>
       <w:r>
         <w:t>4.1.3 Câu h</w:t>
@@ -15923,7 +16036,7 @@
         <w:pStyle w:val="Heading2"/>
       </w:pPr>
       <w:bookmarkStart w:id="48" w:name="phương-pháp-đo"/>
-      <w:bookmarkStart w:id="49" w:name="_Toc243997003"/>
+      <w:bookmarkStart w:id="49" w:name="_Toc243998245"/>
       <w:bookmarkEnd w:id="40"/>
       <w:bookmarkEnd w:id="46"/>
       <w:r>
@@ -16164,7 +16277,7 @@
         <w:pStyle w:val="Heading2"/>
       </w:pPr>
       <w:bookmarkStart w:id="50" w:name="kết-quả-b1"/>
-      <w:bookmarkStart w:id="51" w:name="_Toc243997004"/>
+      <w:bookmarkStart w:id="51" w:name="_Toc243998246"/>
       <w:bookmarkEnd w:id="48"/>
       <w:r>
         <w:t>4.3 K</w:t>
@@ -16188,7 +16301,7 @@
         <w:pStyle w:val="Heading3"/>
       </w:pPr>
       <w:bookmarkStart w:id="52" w:name="so-sánh-chiến-lược-lần-chạy-đầu"/>
-      <w:bookmarkStart w:id="53" w:name="_Toc243997005"/>
+      <w:bookmarkStart w:id="53" w:name="_Toc243998247"/>
       <w:r>
         <w:t>4.3.1 So sánh chi</w:t>
       </w:r>
@@ -17533,7 +17646,7 @@
           <w:noProof/>
         </w:rPr>
         <w:drawing>
-          <wp:inline distT="0" distB="0" distL="0" distR="0" wp14:anchorId="12A230DC" wp14:editId="73391BC5">
+          <wp:inline distT="0" distB="0" distL="0" distR="0" wp14:anchorId="22A33482" wp14:editId="6A2231E8">
             <wp:extent cx="5334000" cy="2667000"/>
             <wp:effectExtent l="0" t="0" r="0" b="0"/>
             <wp:docPr id="37" name="Picture" descr="Hình 2. Input tokens (usage thật) theo từng lần gọi model. Không dọn tăng liên tục tới 86k; cắt thô dao động răng cưa và vẫn vượt 32k; prune + checkpoint giữ dưới ~20k. Sao: checkpoint, tam giác: prune."/>
@@ -18088,7 +18201,7 @@
         <w:pStyle w:val="Heading3"/>
       </w:pPr>
       <w:bookmarkStart w:id="54" w:name="kiểm-chứng-cold-start-slide-22"/>
-      <w:bookmarkStart w:id="55" w:name="_Toc243997006"/>
+      <w:bookmarkStart w:id="55" w:name="_Toc243998248"/>
       <w:bookmarkEnd w:id="52"/>
       <w:r>
         <w:t>4.3.2 Ki</w:t>
@@ -18673,7 +18786,7 @@
         <w:pStyle w:val="Heading3"/>
       </w:pPr>
       <w:bookmarkStart w:id="56" w:name="chạy-lặp"/>
-      <w:bookmarkStart w:id="57" w:name="_Toc243997007"/>
+      <w:bookmarkStart w:id="57" w:name="_Toc243998249"/>
       <w:bookmarkEnd w:id="54"/>
       <w:r>
         <w:t>4.3.3 Ch</w:t>
@@ -20487,7 +20600,7 @@
         <w:pStyle w:val="Heading2"/>
       </w:pPr>
       <w:bookmarkStart w:id="58" w:name="kết-quả-b2"/>
-      <w:bookmarkStart w:id="59" w:name="_Toc243997008"/>
+      <w:bookmarkStart w:id="59" w:name="_Toc243998250"/>
       <w:bookmarkEnd w:id="50"/>
       <w:bookmarkEnd w:id="56"/>
       <w:r>
@@ -21444,7 +21557,7 @@
         </w:rPr>
         <w:lastRenderedPageBreak/>
         <w:drawing>
-          <wp:inline distT="0" distB="0" distL="0" distR="0" wp14:anchorId="70EB4914" wp14:editId="0D5F6F7E">
+          <wp:inline distT="0" distB="0" distL="0" distR="0" wp14:anchorId="3CE18F33" wp14:editId="343F67B4">
             <wp:extent cx="5334000" cy="2667000"/>
             <wp:effectExtent l="0" t="0" r="0" b="0"/>
             <wp:docPr id="44" name="Picture" descr="Hình 3. Tổng input tokens mỗi câu hỏi (thang log). Code Mode đúng cả 3 câu với chi phí thấp nhất."/>
@@ -22658,7 +22771,7 @@
         <w:pStyle w:val="Heading2"/>
       </w:pPr>
       <w:bookmarkStart w:id="60" w:name="phân-tích"/>
-      <w:bookmarkStart w:id="61" w:name="_Toc243997009"/>
+      <w:bookmarkStart w:id="61" w:name="_Toc243998251"/>
       <w:bookmarkEnd w:id="58"/>
       <w:r>
         <w:t>4.5 Phân tích</w:t>
@@ -22670,7 +22783,7 @@
         <w:pStyle w:val="Heading3"/>
       </w:pPr>
       <w:bookmarkStart w:id="62" w:name="X7992a3ab238daf497932af7b2ac9f6a32bd723e"/>
-      <w:bookmarkStart w:id="63" w:name="_Toc243997010"/>
+      <w:bookmarkStart w:id="63" w:name="_Toc243998252"/>
       <w:r>
         <w:t>4.5.1 Checkpoint mang ràng bu</w:t>
       </w:r>
@@ -25328,7 +25441,7 @@
         <w:pStyle w:val="Heading3"/>
       </w:pPr>
       <w:bookmarkStart w:id="64" w:name="compaction-và-prompt-cache-slide-43"/>
-      <w:bookmarkStart w:id="65" w:name="_Toc243997011"/>
+      <w:bookmarkStart w:id="65" w:name="_Toc243998253"/>
       <w:bookmarkEnd w:id="62"/>
       <w:r>
         <w:t>4.5.2 Compaction và prompt cache (slide 43)</w:t>
@@ -25986,7 +26099,7 @@
         <w:pStyle w:val="Heading3"/>
       </w:pPr>
       <w:bookmarkStart w:id="66" w:name="hạn-chế-và-hướng-phát-triển"/>
-      <w:bookmarkStart w:id="67" w:name="_Toc243997012"/>
+      <w:bookmarkStart w:id="67" w:name="_Toc243998254"/>
       <w:bookmarkEnd w:id="64"/>
       <w:r>
         <w:t>4.5.3 H</w:t>
@@ -26340,7 +26453,7 @@
         <w:pStyle w:val="Heading1"/>
       </w:pPr>
       <w:bookmarkStart w:id="68" w:name="demo-web"/>
-      <w:bookmarkStart w:id="69" w:name="_Toc243997013"/>
+      <w:bookmarkStart w:id="69" w:name="_Toc243998255"/>
       <w:bookmarkEnd w:id="38"/>
       <w:bookmarkEnd w:id="60"/>
       <w:bookmarkEnd w:id="66"/>
@@ -27538,7 +27651,7 @@
         </w:rPr>
         <w:lastRenderedPageBreak/>
         <w:drawing>
-          <wp:inline distT="0" distB="0" distL="0" distR="0" wp14:anchorId="2144E58E" wp14:editId="6B273593">
+          <wp:inline distT="0" distB="0" distL="0" distR="0" wp14:anchorId="7F7A2580" wp14:editId="0BFD99C9">
             <wp:extent cx="5334000" cy="3556000"/>
             <wp:effectExtent l="0" t="0" r="0" b="0"/>
             <wp:docPr id="53" name="Picture" descr="Hình 4. Tab Context inspector: context trước (23 message, 8.558 token) và sau lần compact đầu tiên (5 message, 785 token) của run structured-t60-1, có nhãn KEEP / TRUNCATE / DROP cho từng tool result."/>
@@ -27636,7 +27749,7 @@
           <w:noProof/>
         </w:rPr>
         <w:drawing>
-          <wp:inline distT="0" distB="0" distL="0" distR="0" wp14:anchorId="5A3F430F" wp14:editId="47FC7DA0">
+          <wp:inline distT="0" distB="0" distL="0" distR="0" wp14:anchorId="1B017848" wp14:editId="227027D7">
             <wp:extent cx="5334000" cy="3556000"/>
             <wp:effectExtent l="0" t="0" r="0" b="0"/>
             <wp:docPr id="56" name="Picture" descr="Hình 5. Tab B1 Experiments: input tokens mỗi lần gọi model và bảng điểm probe của các run."/>
@@ -27732,7 +27845,7 @@
         </w:rPr>
         <w:lastRenderedPageBreak/>
         <w:drawing>
-          <wp:inline distT="0" distB="0" distL="0" distR="0" wp14:anchorId="3C6C4189" wp14:editId="201AF984">
+          <wp:inline distT="0" distB="0" distL="0" distR="0" wp14:anchorId="43B53A19" wp14:editId="1A82A681">
             <wp:extent cx="5334000" cy="3556000"/>
             <wp:effectExtent l="0" t="0" r="0" b="0"/>
             <wp:docPr id="59" name="Picture" descr="Hình 6. Tab B2 Code Mode: kết quả từng câu hỏi, số dòng log thô lọt vào context và tổng input tokens."/>
@@ -27829,7 +27942,7 @@
         <w:pStyle w:val="Heading1"/>
       </w:pPr>
       <w:bookmarkStart w:id="70" w:name="tài-liệu-tham-khảo"/>
-      <w:bookmarkStart w:id="71" w:name="_Toc243997014"/>
+      <w:bookmarkStart w:id="71" w:name="_Toc243998256"/>
       <w:bookmarkEnd w:id="68"/>
       <w:r>
         <w:t>Tài li</w:t>
@@ -28165,7 +28278,7 @@
   <w:abstractNum w:abstractNumId="0" w15:restartNumberingAfterBreak="0">
     <w:nsid w:val="0000A990"/>
     <w:multiLevelType w:val="multilevel"/>
-    <w:tmpl w:val="D1FC358C"/>
+    <w:tmpl w:val="410CE9CE"/>
     <w:lvl w:ilvl="0">
       <w:numFmt w:val="bullet"/>
       <w:lvlText w:val=" "/>
@@ -28242,7 +28355,7 @@
   <w:abstractNum w:abstractNumId="1" w15:restartNumberingAfterBreak="0">
     <w:nsid w:val="0000A991"/>
     <w:multiLevelType w:val="multilevel"/>
-    <w:tmpl w:val="4608F64A"/>
+    <w:tmpl w:val="9BE429FE"/>
     <w:lvl w:ilvl="0">
       <w:numFmt w:val="bullet"/>
       <w:lvlText w:val=""/>
@@ -28346,7 +28459,7 @@
   <w:abstractNum w:abstractNumId="2" w15:restartNumberingAfterBreak="0">
     <w:nsid w:val="00A99411"/>
     <w:multiLevelType w:val="multilevel"/>
-    <w:tmpl w:val="73A26F76"/>
+    <w:tmpl w:val="097AF518"/>
     <w:lvl w:ilvl="0">
       <w:start w:val="1"/>
       <w:numFmt w:val="decimal"/>
@@ -28429,34 +28542,34 @@
       </w:pPr>
     </w:lvl>
   </w:abstractNum>
-  <w:num w:numId="1" w16cid:durableId="64648491">
+  <w:num w:numId="1" w16cid:durableId="1441409425">
     <w:abstractNumId w:val="0"/>
   </w:num>
-  <w:num w:numId="2" w16cid:durableId="704795388">
+  <w:num w:numId="2" w16cid:durableId="1784420011">
     <w:abstractNumId w:val="1"/>
   </w:num>
-  <w:num w:numId="3" w16cid:durableId="1552035947">
+  <w:num w:numId="3" w16cid:durableId="1965037104">
     <w:abstractNumId w:val="1"/>
   </w:num>
-  <w:num w:numId="4" w16cid:durableId="1205026015">
+  <w:num w:numId="4" w16cid:durableId="690761906">
     <w:abstractNumId w:val="1"/>
   </w:num>
-  <w:num w:numId="5" w16cid:durableId="103961307">
+  <w:num w:numId="5" w16cid:durableId="2013221678">
     <w:abstractNumId w:val="1"/>
   </w:num>
-  <w:num w:numId="6" w16cid:durableId="1581408898">
+  <w:num w:numId="6" w16cid:durableId="916672618">
     <w:abstractNumId w:val="1"/>
   </w:num>
-  <w:num w:numId="7" w16cid:durableId="1592666239">
+  <w:num w:numId="7" w16cid:durableId="769201124">
     <w:abstractNumId w:val="1"/>
   </w:num>
-  <w:num w:numId="8" w16cid:durableId="1498808942">
+  <w:num w:numId="8" w16cid:durableId="298267923">
     <w:abstractNumId w:val="1"/>
   </w:num>
-  <w:num w:numId="9" w16cid:durableId="1347100148">
+  <w:num w:numId="9" w16cid:durableId="504245034">
     <w:abstractNumId w:val="1"/>
   </w:num>
-  <w:num w:numId="10" w16cid:durableId="689527298">
+  <w:num w:numId="10" w16cid:durableId="1785150374">
     <w:abstractNumId w:val="2"/>
     <w:lvlOverride w:ilvl="0">
       <w:startOverride w:val="1"/>
@@ -28486,16 +28599,16 @@
       <w:startOverride w:val="1"/>
     </w:lvlOverride>
   </w:num>
-  <w:num w:numId="11" w16cid:durableId="12071655">
+  <w:num w:numId="11" w16cid:durableId="1649631840">
     <w:abstractNumId w:val="1"/>
   </w:num>
-  <w:num w:numId="12" w16cid:durableId="759252157">
+  <w:num w:numId="12" w16cid:durableId="684551653">
     <w:abstractNumId w:val="1"/>
   </w:num>
-  <w:num w:numId="13" w16cid:durableId="39788912">
+  <w:num w:numId="13" w16cid:durableId="252324283">
     <w:abstractNumId w:val="1"/>
   </w:num>
-  <w:num w:numId="14" w16cid:durableId="1969044693">
+  <w:num w:numId="14" w16cid:durableId="791292402">
     <w:abstractNumId w:val="2"/>
     <w:lvlOverride w:ilvl="0">
       <w:startOverride w:val="1"/>
@@ -29813,7 +29926,7 @@
     <w:next w:val="Normal"/>
     <w:autoRedefine/>
     <w:uiPriority w:val="39"/>
-    <w:rsid w:val="00992519"/>
+    <w:rsid w:val="00123247"/>
     <w:pPr>
       <w:spacing w:after="40"/>
     </w:pPr>
@@ -29827,7 +29940,7 @@
     <w:next w:val="Normal"/>
     <w:autoRedefine/>
     <w:uiPriority w:val="39"/>
-    <w:rsid w:val="00992519"/>
+    <w:rsid w:val="00123247"/>
     <w:pPr>
       <w:spacing w:after="40"/>
       <w:ind w:left="260"/>
@@ -29842,7 +29955,7 @@
     <w:next w:val="Normal"/>
     <w:autoRedefine/>
     <w:uiPriority w:val="39"/>
-    <w:rsid w:val="00992519"/>
+    <w:rsid w:val="00123247"/>
     <w:pPr>
       <w:spacing w:after="40"/>
       <w:ind w:left="520"/>
@@ -29855,7 +29968,7 @@
     <w:name w:val="header"/>
     <w:basedOn w:val="Normal"/>
     <w:link w:val="HeaderChar"/>
-    <w:rsid w:val="00992519"/>
+    <w:rsid w:val="00123247"/>
     <w:pPr>
       <w:tabs>
         <w:tab w:val="center" w:pos="4680"/>
@@ -29868,7 +29981,7 @@
     <w:name w:val="Header Char"/>
     <w:basedOn w:val="DefaultParagraphFont"/>
     <w:link w:val="Header"/>
-    <w:rsid w:val="00992519"/>
+    <w:rsid w:val="00123247"/>
     <w:rPr>
       <w:rFonts w:ascii="Times New Roman" w:hAnsi="Times New Roman" w:cs="Times New Roman"/>
       <w:sz w:val="26"/>
@@ -29878,7 +29991,7 @@
     <w:name w:val="footer"/>
     <w:basedOn w:val="Normal"/>
     <w:link w:val="FooterChar"/>
-    <w:rsid w:val="00992519"/>
+    <w:rsid w:val="00123247"/>
     <w:pPr>
       <w:tabs>
         <w:tab w:val="center" w:pos="4680"/>
@@ -29891,7 +30004,7 @@
     <w:name w:val="Footer Char"/>
     <w:basedOn w:val="DefaultParagraphFont"/>
     <w:link w:val="Footer"/>
-    <w:rsid w:val="00992519"/>
+    <w:rsid w:val="00123247"/>
     <w:rPr>
       <w:rFonts w:ascii="Times New Roman" w:hAnsi="Times New Roman" w:cs="Times New Roman"/>
       <w:sz w:val="26"/>

</xml_diff>